<commit_message>
Add portfolio & GitHub links to resume, update downloadable copy
</commit_message>
<xml_diff>
--- a/public/Herat_Shah_IT_Project_Coordinator_Resume.docx
+++ b/public/Herat_Shah_IT_Project_Coordinator_Resume.docx
@@ -81,6 +81,30 @@
           <w:t xml:space="preserve">linkedin.com/in/heratshah1810</w:t>
         </w:r>
       </w:hyperlink>
+      <w:r>
+        <w:rPr>
+          <w:sz w:val="20"/>
+        </w:rPr>
+        <w:br/>
+      </w:r>
+      <w:r>
+        <w:rPr>
+          <w:sz w:val="20"/>
+        </w:rPr>
+        <w:t>Portfolio: portfolio-fawn-tau-90.vercel.app</w:t>
+      </w:r>
+      <w:r>
+        <w:rPr>
+          <w:sz w:val="20"/>
+        </w:rPr>
+        <w:t xml:space="preserve">  •  </w:t>
+      </w:r>
+      <w:r>
+        <w:rPr>
+          <w:sz w:val="20"/>
+        </w:rPr>
+        <w:t>GitHub: github.com/heratshah50-gif/herat-shah-portfolio</w:t>
+      </w:r>
     </w:p>
     <w:p>
       <w:pPr>

</xml_diff>

<commit_message>
refactor: ATS-friendly modern resume template with clickable links
</commit_message>
<xml_diff>
--- a/public/Herat_Shah_IT_Project_Coordinator_Resume.docx
+++ b/public/Herat_Shah_IT_Project_Coordinator_Resume.docx
@@ -18,12 +18,12 @@
     </w:p>
     <w:p>
       <w:pPr>
-        <w:spacing w:before="0" w:after="0"/>
+        <w:spacing w:before="0" w:after="40"/>
         <w:jc w:val="center"/>
       </w:pPr>
       <w:r>
         <w:rPr>
-          <w:color w:val="475266"/>
+          <w:color w:val="6B7280"/>
           <w:sz w:val="22"/>
         </w:rPr>
         <w:t>IT Project Coordinator | Associate Project Manager</w:t>
@@ -31,36 +31,293 @@
     </w:p>
     <w:p>
       <w:pPr>
-        <w:spacing w:before="40" w:after="0"/>
+        <w:spacing w:after="0"/>
         <w:jc w:val="center"/>
       </w:pPr>
       <w:r>
         <w:rPr>
-          <w:color w:val="64748B"/>
+          <w:color w:val="6B7280"/>
           <w:sz w:val="19"/>
         </w:rPr>
-        <w:t>Ahmedabad, India  |  +91-7698225335  |  heratshah50@gmail.com</w:t>
+        <w:t xml:space="preserve">Ahmedabad, IN  |  +91-7698225335  |  </w:t>
+      </w:r>
+      <w:hyperlink r:id="rId9">
+        <w:r>
+          <w:rPr>
+            <w:rStyle w:val="Hyperlink"/>
+            <w:color w:val="7C3AED"/>
+            <w:u w:val="single"/>
+            <w:sz w:val="20"/>
+            <w:rFonts w:ascii="Calibri" w:hAnsi="Calibri"/>
+          </w:rPr>
+          <w:t xml:space="preserve">heratshah50@gmail.com</w:t>
+        </w:r>
+      </w:hyperlink>
+      <w:r>
+        <w:rPr>
+          <w:color w:val="6B7280"/>
+          <w:sz w:val="19"/>
+        </w:rPr>
+        <w:t xml:space="preserve">  |  </w:t>
+      </w:r>
+      <w:hyperlink r:id="rId10">
+        <w:r>
+          <w:rPr>
+            <w:rStyle w:val="Hyperlink"/>
+            <w:color w:val="7C3AED"/>
+            <w:u w:val="single"/>
+            <w:sz w:val="20"/>
+            <w:rFonts w:ascii="Calibri" w:hAnsi="Calibri"/>
+          </w:rPr>
+          <w:t xml:space="preserve">LinkedIn</w:t>
+        </w:r>
+      </w:hyperlink>
+      <w:r>
+        <w:rPr>
+          <w:color w:val="6B7280"/>
+          <w:sz w:val="19"/>
+        </w:rPr>
+        <w:t xml:space="preserve">  |  </w:t>
+      </w:r>
+      <w:hyperlink r:id="rId11">
+        <w:r>
+          <w:rPr>
+            <w:rStyle w:val="Hyperlink"/>
+            <w:color w:val="7C3AED"/>
+            <w:u w:val="single"/>
+            <w:sz w:val="20"/>
+            <w:rFonts w:ascii="Calibri" w:hAnsi="Calibri"/>
+          </w:rPr>
+          <w:t xml:space="preserve">Portfolio</w:t>
+        </w:r>
+      </w:hyperlink>
+      <w:r>
+        <w:rPr>
+          <w:color w:val="6B7280"/>
+          <w:sz w:val="19"/>
+        </w:rPr>
+        <w:t xml:space="preserve">  |  </w:t>
+      </w:r>
+      <w:hyperlink r:id="rId12">
+        <w:r>
+          <w:rPr>
+            <w:rStyle w:val="Hyperlink"/>
+            <w:color w:val="7C3AED"/>
+            <w:u w:val="single"/>
+            <w:sz w:val="20"/>
+            <w:rFonts w:ascii="Calibri" w:hAnsi="Calibri"/>
+          </w:rPr>
+          <w:t xml:space="preserve">GitHub</w:t>
+        </w:r>
+      </w:hyperlink>
+    </w:p>
+    <w:p>
+      <w:pPr>
+        <w:keepNext/>
+        <w:spacing w:before="280" w:after="80"/>
+        <w:pBdr>
+          <w:bottom w:val="single" w:sz="8" w:space="1" w:color="7C3AED"/>
+        </w:pBdr>
+      </w:pPr>
+      <w:r>
+        <w:rPr>
+          <w:b/>
+          <w:color w:val="1E293B"/>
+          <w:sz w:val="23"/>
+        </w:rPr>
+        <w:t>PROFESSIONAL SUMMARY</w:t>
       </w:r>
     </w:p>
     <w:p>
       <w:pPr>
-        <w:spacing w:before="0" w:after="80"/>
-        <w:jc w:val="center"/>
+        <w:spacing w:before="0" w:after="40"/>
       </w:pPr>
       <w:r>
         <w:rPr>
-          <w:color w:val="64748B"/>
-          <w:sz w:val="19"/>
+          <w:rFonts w:ascii="Calibri" w:hAnsi="Calibri"/>
+          <w:b w:val="0"/>
+          <w:color w:val="333333"/>
+          <w:sz w:val="21"/>
         </w:rPr>
-        <w:t>linkedin.com/in/heratshah1810  |  portfolio-fawn-tau-90.vercel.app  |  github.com/heratshah50-gif/herat-shah-portfolio</w:t>
+        <w:t>Results-driven IT Project Coordinator with 4+ years of experience delivering SaaS, CRM, and HRMS projects in Agile/Scrum environments. Reduced documentation gaps by 60%, cut stakeholder response times by 30%, and delivered 3 platform modules ahead of schedule. Expert in BRD/FRD/PRD authoring, cross-functional team coordination, risk management, and stakeholder communication. Adept at bridging technical and business teams to drive on-time, on-scope delivery.</w:t>
       </w:r>
     </w:p>
     <w:p>
       <w:pPr>
-        <w:spacing w:before="240" w:after="80"/>
+        <w:keepNext/>
+        <w:spacing w:before="280" w:after="80"/>
         <w:pBdr>
-          <w:bottom w:val="single" w:sz="6" w:space="1" w:color="7C3AED"/>
+          <w:bottom w:val="single" w:sz="8" w:space="1" w:color="7C3AED"/>
         </w:pBdr>
+      </w:pPr>
+      <w:r>
+        <w:rPr>
+          <w:b/>
+          <w:color w:val="1E293B"/>
+          <w:sz w:val="23"/>
+        </w:rPr>
+        <w:t>CORE COMPETENCIES</w:t>
+      </w:r>
+    </w:p>
+    <w:p>
+      <w:pPr>
+        <w:spacing w:before="20" w:after="20"/>
+        <w:ind w:left="216"/>
+      </w:pPr>
+      <w:r>
+        <w:rPr>
+          <w:rFonts w:ascii="Calibri" w:hAnsi="Calibri"/>
+          <w:b/>
+          <w:color w:val="1E293B"/>
+          <w:sz w:val="20"/>
+        </w:rPr>
+        <w:t>Project Management:</w:t>
+      </w:r>
+      <w:r>
+        <w:rPr>
+          <w:rFonts w:ascii="Calibri" w:hAnsi="Calibri"/>
+          <w:color w:val="333333"/>
+          <w:sz w:val="20"/>
+        </w:rPr>
+        <w:t xml:space="preserve"> Agile, Scrum, Sprint Planning, SDLC, Risk Management, Release Management, Jira</w:t>
+      </w:r>
+    </w:p>
+    <w:p>
+      <w:pPr>
+        <w:spacing w:before="20" w:after="20"/>
+        <w:ind w:left="216"/>
+      </w:pPr>
+      <w:r>
+        <w:rPr>
+          <w:rFonts w:ascii="Calibri" w:hAnsi="Calibri"/>
+          <w:b/>
+          <w:color w:val="1E293B"/>
+          <w:sz w:val="20"/>
+        </w:rPr>
+        <w:t>Documentation &amp; Analysis:</w:t>
+      </w:r>
+      <w:r>
+        <w:rPr>
+          <w:rFonts w:ascii="Calibri" w:hAnsi="Calibri"/>
+          <w:color w:val="333333"/>
+          <w:sz w:val="20"/>
+        </w:rPr>
+        <w:t xml:space="preserve"> BRD, FRD, PRD, Technical Documentation, Requirement Gathering, Process Mapping</w:t>
+      </w:r>
+    </w:p>
+    <w:p>
+      <w:pPr>
+        <w:spacing w:before="20" w:after="20"/>
+        <w:ind w:left="216"/>
+      </w:pPr>
+      <w:r>
+        <w:rPr>
+          <w:rFonts w:ascii="Calibri" w:hAnsi="Calibri"/>
+          <w:b/>
+          <w:color w:val="1E293B"/>
+          <w:sz w:val="20"/>
+        </w:rPr>
+        <w:t>Tools &amp; Platforms:</w:t>
+      </w:r>
+      <w:r>
+        <w:rPr>
+          <w:rFonts w:ascii="Calibri" w:hAnsi="Calibri"/>
+          <w:color w:val="333333"/>
+          <w:sz w:val="20"/>
+        </w:rPr>
+        <w:t xml:space="preserve"> Jira, GCP, Google Workspace, MS Office, Slack, Git, GitHub, Vercel, Figma</w:t>
+      </w:r>
+    </w:p>
+    <w:p>
+      <w:pPr>
+        <w:spacing w:before="20" w:after="20"/>
+        <w:ind w:left="216"/>
+      </w:pPr>
+      <w:r>
+        <w:rPr>
+          <w:rFonts w:ascii="Calibri" w:hAnsi="Calibri"/>
+          <w:b/>
+          <w:color w:val="1E293B"/>
+          <w:sz w:val="20"/>
+        </w:rPr>
+        <w:t>Coordination &amp; Leadership:</w:t>
+      </w:r>
+      <w:r>
+        <w:rPr>
+          <w:rFonts w:ascii="Calibri" w:hAnsi="Calibri"/>
+          <w:color w:val="333333"/>
+          <w:sz w:val="20"/>
+        </w:rPr>
+        <w:t xml:space="preserve"> Cross-functional Teams, Stakeholder Communication, Vendor Management, Remote Collaboration</w:t>
+      </w:r>
+    </w:p>
+    <w:p>
+      <w:pPr>
+        <w:spacing w:before="20" w:after="20"/>
+        <w:ind w:left="216"/>
+      </w:pPr>
+      <w:r>
+        <w:rPr>
+          <w:rFonts w:ascii="Calibri" w:hAnsi="Calibri"/>
+          <w:b/>
+          <w:color w:val="1E293B"/>
+          <w:sz w:val="20"/>
+        </w:rPr>
+        <w:t>Technical Proficiency:</w:t>
+      </w:r>
+      <w:r>
+        <w:rPr>
+          <w:rFonts w:ascii="Calibri" w:hAnsi="Calibri"/>
+          <w:color w:val="333333"/>
+          <w:sz w:val="20"/>
+        </w:rPr>
+        <w:t xml:space="preserve"> AI-Assisted Workflows, Prompt Engineering, RAG, Vector DBs, React, Python, Node.js</w:t>
+      </w:r>
+    </w:p>
+    <w:p>
+      <w:pPr>
+        <w:spacing w:before="20" w:after="20"/>
+        <w:ind w:left="216"/>
+      </w:pPr>
+      <w:r>
+        <w:rPr>
+          <w:rFonts w:ascii="Calibri" w:hAnsi="Calibri"/>
+          <w:b/>
+          <w:color w:val="1E293B"/>
+          <w:sz w:val="20"/>
+        </w:rPr>
+        <w:t>Process Optimization:</w:t>
+      </w:r>
+      <w:r>
+        <w:rPr>
+          <w:rFonts w:ascii="Calibri" w:hAnsi="Calibri"/>
+          <w:color w:val="333333"/>
+          <w:sz w:val="20"/>
+        </w:rPr>
+        <w:t xml:space="preserve"> Workflow Automation, SOP Development, KPI Tracking, QA Coordination, Data Analysis</w:t>
+      </w:r>
+    </w:p>
+    <w:p>
+      <w:pPr>
+        <w:keepNext/>
+        <w:spacing w:before="280" w:after="80"/>
+        <w:pBdr>
+          <w:bottom w:val="single" w:sz="8" w:space="1" w:color="7C3AED"/>
+        </w:pBdr>
+      </w:pPr>
+      <w:r>
+        <w:rPr>
+          <w:b/>
+          <w:color w:val="1E293B"/>
+          <w:sz w:val="23"/>
+        </w:rPr>
+        <w:t>PROFESSIONAL EXPERIENCE</w:t>
+      </w:r>
+    </w:p>
+    <w:p>
+      <w:pPr>
+        <w:keepNext/>
+        <w:spacing w:before="120" w:after="0"/>
       </w:pPr>
       <w:r>
         <w:rPr>
@@ -68,26 +325,124 @@
           <w:color w:val="1E293B"/>
           <w:sz w:val="22"/>
         </w:rPr>
-        <w:t>PROFESSIONAL SUMMARY</w:t>
+        <w:t>IT Project Coordinator</w:t>
+      </w:r>
+      <w:r>
+        <w:rPr>
+          <w:color w:val="6B7280"/>
+          <w:sz w:val="21"/>
+        </w:rPr>
+        <w:t xml:space="preserve">  |  Cord4 Technologies, Ahmedabad</w:t>
       </w:r>
     </w:p>
     <w:p>
       <w:pPr>
-        <w:spacing w:after="40"/>
+        <w:spacing w:before="0" w:after="60"/>
       </w:pPr>
       <w:r>
         <w:rPr>
-          <w:sz w:val="21"/>
+          <w:rFonts w:ascii="Calibri" w:hAnsi="Calibri"/>
+          <w:b w:val="0"/>
+          <w:color w:val="7C3AED"/>
+          <w:sz w:val="20"/>
         </w:rPr>
-        <w:t>Results-driven IT Project Coordinator with 4+ years of experience delivering SaaS, CRM, and HRMS projects in Agile/Scrum environments. Proven track record of reducing documentation gaps by 60%, cutting stakeholder response times by 30%, and delivering 3 platform modules on schedule. Skilled in BRD/FRD/PRD authoring, cross-functional team coordination, risk management, and stakeholder communication. Adept at bridging technical and business teams to drive on-time, on-scope delivery. Currently seeking Project Coordinator, Associate Project Manager, or Project Manager roles.</w:t>
+        <w:t>Jan 2026 – Present</w:t>
       </w:r>
     </w:p>
     <w:p>
       <w:pPr>
-        <w:spacing w:before="240" w:after="80"/>
-        <w:pBdr>
-          <w:bottom w:val="single" w:sz="6" w:space="1" w:color="7C3AED"/>
-        </w:pBdr>
+        <w:spacing w:before="20" w:after="60"/>
+        <w:ind w:left="432" w:hanging="216"/>
+        <w:ind w:left="285" w:hanging="140"/>
+      </w:pPr>
+      <w:r>
+        <w:rPr>
+          <w:rFonts w:ascii="Calibri" w:hAnsi="Calibri"/>
+          <w:color w:val="333333"/>
+          <w:sz w:val="21"/>
+        </w:rPr>
+        <w:t>• Delivered 3 SaaS platform modules (HRMS, CRM, Workflow Automation) within agreed timelines by introducing centralized sprint tracking and structured Agile ceremonies.</w:t>
+      </w:r>
+    </w:p>
+    <w:p>
+      <w:pPr>
+        <w:spacing w:before="20" w:after="60"/>
+        <w:ind w:left="432" w:hanging="216"/>
+        <w:ind w:left="285" w:hanging="140"/>
+      </w:pPr>
+      <w:r>
+        <w:rPr>
+          <w:rFonts w:ascii="Calibri" w:hAnsi="Calibri"/>
+          <w:color w:val="333333"/>
+          <w:sz w:val="21"/>
+        </w:rPr>
+        <w:t>• Authored 20+ BRDs, FRDs, and PRDs across concurrent projects — reducing documentation gaps by 60% through standardized templates and a centralized repository.</w:t>
+      </w:r>
+    </w:p>
+    <w:p>
+      <w:pPr>
+        <w:spacing w:before="20" w:after="60"/>
+        <w:ind w:left="432" w:hanging="216"/>
+        <w:ind w:left="285" w:hanging="140"/>
+      </w:pPr>
+      <w:r>
+        <w:rPr>
+          <w:rFonts w:ascii="Calibri" w:hAnsi="Calibri"/>
+          <w:color w:val="333333"/>
+          <w:sz w:val="21"/>
+        </w:rPr>
+        <w:t>• Led cross-functional teams of 8–12 developers, designers, and QA engineers across the full SDLC: sprint planning, daily stand-ups, retrospectives, and production releases.</w:t>
+      </w:r>
+    </w:p>
+    <w:p>
+      <w:pPr>
+        <w:spacing w:before="20" w:after="60"/>
+        <w:ind w:left="432" w:hanging="216"/>
+        <w:ind w:left="285" w:hanging="140"/>
+      </w:pPr>
+      <w:r>
+        <w:rPr>
+          <w:rFonts w:ascii="Calibri" w:hAnsi="Calibri"/>
+          <w:color w:val="333333"/>
+          <w:sz w:val="21"/>
+        </w:rPr>
+        <w:t>• Managed stakeholder communication for 5+ concurrent workstreams, cutting average response time by ~30% through structured weekly reporting cadences.</w:t>
+      </w:r>
+    </w:p>
+    <w:p>
+      <w:pPr>
+        <w:spacing w:before="20" w:after="60"/>
+        <w:ind w:left="432" w:hanging="216"/>
+        <w:ind w:left="285" w:hanging="140"/>
+      </w:pPr>
+      <w:r>
+        <w:rPr>
+          <w:rFonts w:ascii="Calibri" w:hAnsi="Calibri"/>
+          <w:color w:val="333333"/>
+          <w:sz w:val="21"/>
+        </w:rPr>
+        <w:t>• Oversaw Google Cloud Console (IAM, OAuth 2.0, storage, compute) and coordinated app verification for secure third-party authentication.</w:t>
+      </w:r>
+    </w:p>
+    <w:p>
+      <w:pPr>
+        <w:spacing w:before="20" w:after="60"/>
+        <w:ind w:left="432" w:hanging="216"/>
+        <w:ind w:left="285" w:hanging="140"/>
+      </w:pPr>
+      <w:r>
+        <w:rPr>
+          <w:rFonts w:ascii="Calibri" w:hAnsi="Calibri"/>
+          <w:color w:val="333333"/>
+          <w:sz w:val="21"/>
+        </w:rPr>
+        <w:t>• Spearheaded CRM and HRMS platform implementations with workflow automation, improving cross-department operational efficiency.</w:t>
+      </w:r>
+    </w:p>
+    <w:p>
+      <w:pPr>
+        <w:keepNext/>
+        <w:spacing w:before="160" w:after="0"/>
       </w:pPr>
       <w:r>
         <w:rPr>
@@ -95,260 +450,79 @@
           <w:color w:val="1E293B"/>
           <w:sz w:val="22"/>
         </w:rPr>
-        <w:t>CORE COMPETENCIES</w:t>
+        <w:t>Technical Sales Specialist</w:t>
+      </w:r>
+      <w:r>
+        <w:rPr>
+          <w:color w:val="6B7280"/>
+          <w:sz w:val="21"/>
+        </w:rPr>
+        <w:t xml:space="preserve">  |  Zedd CSR, Toronto</w:t>
       </w:r>
     </w:p>
-    <w:tbl>
-      <w:tblPr>
-        <w:tblStyle w:val="TableGrid"/>
-        <w:tblW w:type="auto" w:w="0"/>
-        <w:tblLook w:firstColumn="1" w:firstRow="1" w:lastColumn="0" w:lastRow="0" w:noHBand="0" w:noVBand="1" w:val="04A0"/>
-      </w:tblPr>
-      <w:tblGrid>
-        <w:gridCol w:w="5040"/>
-        <w:gridCol w:w="5040"/>
-      </w:tblGrid>
-      <w:tr>
-        <w:tc>
-          <w:tcPr>
-            <w:tcW w:type="dxa" w:w="5040"/>
-            <w:tcBorders>
-              <w:top w:val="nil"/>
-              <w:left w:val="nil"/>
-              <w:bottom w:val="nil"/>
-              <w:right w:val="nil"/>
-            </w:tcBorders>
-          </w:tcPr>
-          <w:p>
-            <w:pPr>
-              <w:spacing w:before="20" w:after="20"/>
-            </w:pPr>
-            <w:r/>
-            <w:r>
-              <w:rPr>
-                <w:rFonts w:ascii="Calibri" w:hAnsi="Calibri"/>
-                <w:b/>
-                <w:sz w:val="19"/>
-              </w:rPr>
-              <w:t xml:space="preserve">Project Management: </w:t>
-            </w:r>
-            <w:r>
-              <w:rPr>
-                <w:rFonts w:ascii="Calibri" w:hAnsi="Calibri"/>
-                <w:sz w:val="19"/>
-              </w:rPr>
-              <w:t>Agile &amp; Scrum, Sprint Planning, SDLC, Risk Management, Release Mgmt</w:t>
-            </w:r>
-          </w:p>
-        </w:tc>
-        <w:tc>
-          <w:tcPr>
-            <w:tcW w:type="dxa" w:w="5040"/>
-            <w:tcBorders>
-              <w:top w:val="nil"/>
-              <w:left w:val="nil"/>
-              <w:bottom w:val="nil"/>
-              <w:right w:val="nil"/>
-            </w:tcBorders>
-          </w:tcPr>
-          <w:p>
-            <w:pPr>
-              <w:spacing w:before="20" w:after="20"/>
-            </w:pPr>
-            <w:r/>
-            <w:r>
-              <w:rPr>
-                <w:rFonts w:ascii="Calibri" w:hAnsi="Calibri"/>
-                <w:b/>
-                <w:sz w:val="19"/>
-              </w:rPr>
-              <w:t xml:space="preserve">Documentation &amp; Analysis: </w:t>
-            </w:r>
-            <w:r>
-              <w:rPr>
-                <w:rFonts w:ascii="Calibri" w:hAnsi="Calibri"/>
-                <w:sz w:val="19"/>
-              </w:rPr>
-              <w:t>BRD / FRD / PRD Authoring, Requirement Gathering, Technical Documentation</w:t>
-            </w:r>
-          </w:p>
-        </w:tc>
-      </w:tr>
-      <w:tr>
-        <w:tc>
-          <w:tcPr>
-            <w:tcW w:type="dxa" w:w="5040"/>
-            <w:tcBorders>
-              <w:top w:val="nil"/>
-              <w:left w:val="nil"/>
-              <w:bottom w:val="nil"/>
-              <w:right w:val="nil"/>
-            </w:tcBorders>
-          </w:tcPr>
-          <w:p>
-            <w:pPr>
-              <w:spacing w:before="20" w:after="20"/>
-            </w:pPr>
-            <w:r/>
-            <w:r>
-              <w:rPr>
-                <w:rFonts w:ascii="Calibri" w:hAnsi="Calibri"/>
-                <w:b/>
-                <w:sz w:val="19"/>
-              </w:rPr>
-              <w:t xml:space="preserve">Tools &amp; Platforms: </w:t>
-            </w:r>
-            <w:r>
-              <w:rPr>
-                <w:rFonts w:ascii="Calibri" w:hAnsi="Calibri"/>
-                <w:sz w:val="19"/>
-              </w:rPr>
-              <w:t>Jira, GCP, Google Workspace, MS Office, Slack, Git, GitHub, Vercel, Figma</w:t>
-            </w:r>
-          </w:p>
-        </w:tc>
-        <w:tc>
-          <w:tcPr>
-            <w:tcW w:type="dxa" w:w="5040"/>
-            <w:tcBorders>
-              <w:top w:val="nil"/>
-              <w:left w:val="nil"/>
-              <w:bottom w:val="nil"/>
-              <w:right w:val="nil"/>
-            </w:tcBorders>
-          </w:tcPr>
-          <w:p>
-            <w:pPr>
-              <w:spacing w:before="20" w:after="20"/>
-            </w:pPr>
-            <w:r/>
-            <w:r>
-              <w:rPr>
-                <w:rFonts w:ascii="Calibri" w:hAnsi="Calibri"/>
-                <w:b/>
-                <w:sz w:val="19"/>
-              </w:rPr>
-              <w:t xml:space="preserve">Coordination &amp; Leadership: </w:t>
-            </w:r>
-            <w:r>
-              <w:rPr>
-                <w:rFonts w:ascii="Calibri" w:hAnsi="Calibri"/>
-                <w:sz w:val="19"/>
-              </w:rPr>
-              <w:t>Cross-functional Teams, Stakeholder Communication, Remote Teams, UI/UX Coordination</w:t>
-            </w:r>
-          </w:p>
-        </w:tc>
-      </w:tr>
-      <w:tr>
-        <w:tc>
-          <w:tcPr>
-            <w:tcW w:type="dxa" w:w="5040"/>
-            <w:tcBorders>
-              <w:top w:val="nil"/>
-              <w:left w:val="nil"/>
-              <w:bottom w:val="nil"/>
-              <w:right w:val="nil"/>
-            </w:tcBorders>
-          </w:tcPr>
-          <w:p>
-            <w:pPr>
-              <w:spacing w:before="20" w:after="20"/>
-            </w:pPr>
-            <w:r/>
-            <w:r>
-              <w:rPr>
-                <w:rFonts w:ascii="Calibri" w:hAnsi="Calibri"/>
-                <w:b/>
-                <w:sz w:val="19"/>
-              </w:rPr>
-              <w:t xml:space="preserve">Technical Proficiency: </w:t>
-            </w:r>
-            <w:r>
-              <w:rPr>
-                <w:rFonts w:ascii="Calibri" w:hAnsi="Calibri"/>
-                <w:sz w:val="19"/>
-              </w:rPr>
-              <w:t>AI-Assisted Workflows, Prompt Engineering, RAG, Vector DBs, React, Python, Node.js</w:t>
-            </w:r>
-          </w:p>
-        </w:tc>
-        <w:tc>
-          <w:tcPr>
-            <w:tcW w:type="dxa" w:w="5040"/>
-            <w:tcBorders>
-              <w:top w:val="nil"/>
-              <w:left w:val="nil"/>
-              <w:bottom w:val="nil"/>
-              <w:right w:val="nil"/>
-            </w:tcBorders>
-          </w:tcPr>
-          <w:p>
-            <w:pPr>
-              <w:spacing w:before="20" w:after="20"/>
-            </w:pPr>
-            <w:r/>
-            <w:r>
-              <w:rPr>
-                <w:rFonts w:ascii="Calibri" w:hAnsi="Calibri"/>
-                <w:b/>
-                <w:sz w:val="19"/>
-              </w:rPr>
-              <w:t xml:space="preserve">Process Optimization: </w:t>
-            </w:r>
-            <w:r>
-              <w:rPr>
-                <w:rFonts w:ascii="Calibri" w:hAnsi="Calibri"/>
-                <w:sz w:val="19"/>
-              </w:rPr>
-              <w:t>Workflow Automation, SOP Development, KPI Tracking, QA Coordination</w:t>
-            </w:r>
-          </w:p>
-        </w:tc>
-      </w:tr>
-      <w:tr>
-        <w:tc>
-          <w:tcPr>
-            <w:tcW w:type="dxa" w:w="5040"/>
-            <w:tcBorders>
-              <w:top w:val="nil"/>
-              <w:left w:val="nil"/>
-              <w:bottom w:val="nil"/>
-              <w:right w:val="nil"/>
-            </w:tcBorders>
-          </w:tcPr>
-          <w:p>
-            <w:pPr>
-              <w:spacing w:before="20" w:after="20"/>
-            </w:pPr>
-            <w:r/>
-          </w:p>
-        </w:tc>
-        <w:tc>
-          <w:tcPr>
-            <w:tcW w:type="dxa" w:w="5040"/>
-            <w:tcBorders>
-              <w:top w:val="nil"/>
-              <w:left w:val="nil"/>
-              <w:bottom w:val="nil"/>
-              <w:right w:val="nil"/>
-            </w:tcBorders>
-          </w:tcPr>
-          <w:p>
-            <w:pPr>
-              <w:spacing w:before="20" w:after="20"/>
-            </w:pPr>
-            <w:r/>
-          </w:p>
-        </w:tc>
-      </w:tr>
-    </w:tbl>
     <w:p>
       <w:pPr>
-        <w:spacing w:before="240" w:after="80"/>
-        <w:pBdr>
-          <w:bottom w:val="single" w:sz="6" w:space="1" w:color="7C3AED"/>
-        </w:pBdr>
+        <w:spacing w:before="0" w:after="60"/>
+      </w:pPr>
+      <w:r>
+        <w:rPr>
+          <w:rFonts w:ascii="Calibri" w:hAnsi="Calibri"/>
+          <w:b w:val="0"/>
+          <w:color w:val="7C3AED"/>
+          <w:sz w:val="20"/>
+        </w:rPr>
+        <w:t>Apr 2024 – Oct 2025</w:t>
+      </w:r>
+    </w:p>
+    <w:p>
+      <w:pPr>
+        <w:spacing w:before="20" w:after="60"/>
+        <w:ind w:left="432" w:hanging="216"/>
+        <w:ind w:left="285" w:hanging="140"/>
+      </w:pPr>
+      <w:r>
+        <w:rPr>
+          <w:rFonts w:ascii="Calibri" w:hAnsi="Calibri"/>
+          <w:color w:val="333333"/>
+          <w:sz w:val="21"/>
+        </w:rPr>
+        <w:t>• Managed end-to-end technical sales cycle — qualifying leads, conducting product demos, and tailoring proposals for IT solutions.</w:t>
+      </w:r>
+    </w:p>
+    <w:p>
+      <w:pPr>
+        <w:spacing w:before="20" w:after="60"/>
+        <w:ind w:left="432" w:hanging="216"/>
+        <w:ind w:left="285" w:hanging="140"/>
+      </w:pPr>
+      <w:r>
+        <w:rPr>
+          <w:rFonts w:ascii="Calibri" w:hAnsi="Calibri"/>
+          <w:color w:val="333333"/>
+          <w:sz w:val="21"/>
+        </w:rPr>
+        <w:t>• Acted as primary bridge between clients and technical teams, ensuring accurate scoping and aligned expectations for solution delivery.</w:t>
+      </w:r>
+    </w:p>
+    <w:p>
+      <w:pPr>
+        <w:spacing w:before="20" w:after="60"/>
+        <w:ind w:left="432" w:hanging="216"/>
+        <w:ind w:left="285" w:hanging="140"/>
+      </w:pPr>
+      <w:r>
+        <w:rPr>
+          <w:rFonts w:ascii="Calibri" w:hAnsi="Calibri"/>
+          <w:color w:val="333333"/>
+          <w:sz w:val="21"/>
+        </w:rPr>
+        <w:t>• Maintained CRM pipelines and leveraged analytics to improve lead conversion workflows and team reporting efficiency.</w:t>
+      </w:r>
+    </w:p>
+    <w:p>
+      <w:pPr>
+        <w:keepNext/>
+        <w:spacing w:before="160" w:after="0"/>
       </w:pPr>
       <w:r>
         <w:rPr>
@@ -356,399 +530,79 @@
           <w:color w:val="1E293B"/>
           <w:sz w:val="22"/>
         </w:rPr>
-        <w:t>PROFESSIONAL EXPERIENCE</w:t>
+        <w:t>Technical Support Specialist</w:t>
+      </w:r>
+      <w:r>
+        <w:rPr>
+          <w:color w:val="6B7280"/>
+          <w:sz w:val="21"/>
+        </w:rPr>
+        <w:t xml:space="preserve">  |  Rogers Communications, Toronto</w:t>
       </w:r>
     </w:p>
     <w:p>
       <w:pPr>
-        <w:spacing w:before="120" w:after="20"/>
+        <w:spacing w:before="0" w:after="60"/>
       </w:pPr>
       <w:r>
         <w:rPr>
-          <w:b/>
-          <w:sz w:val="22"/>
-        </w:rPr>
-        <w:t>IT Project Coordinator</w:t>
-      </w:r>
-      <w:r>
-        <w:rPr>
-          <w:color w:val="64748B"/>
+          <w:rFonts w:ascii="Calibri" w:hAnsi="Calibri"/>
+          <w:b w:val="0"/>
+          <w:color w:val="7C3AED"/>
           <w:sz w:val="20"/>
         </w:rPr>
-        <w:t xml:space="preserve">  |  Cord4 Technologies, Ahmedabad  |  Jan 2026 – Present</w:t>
+        <w:t>2021 – 2023</w:t>
       </w:r>
     </w:p>
     <w:p>
       <w:pPr>
-        <w:pStyle w:val="ListBullet"/>
-        <w:spacing w:before="20" w:after="20"/>
-        <w:ind w:left="360"/>
+        <w:spacing w:before="20" w:after="60"/>
+        <w:ind w:left="432" w:hanging="216"/>
+        <w:ind w:left="285" w:hanging="140"/>
       </w:pPr>
       <w:r>
         <w:rPr>
           <w:rFonts w:ascii="Calibri" w:hAnsi="Calibri"/>
-          <w:b/>
+          <w:color w:val="333333"/>
           <w:sz w:val="21"/>
         </w:rPr>
-        <w:t xml:space="preserve">Delivered </w:t>
-      </w:r>
-      <w:r>
-        <w:rPr>
-          <w:rFonts w:ascii="Calibri" w:hAnsi="Calibri"/>
-          <w:sz w:val="21"/>
-        </w:rPr>
-        <w:t>3 SaaS platform modules (HRMS, CRM, Workflow Automation) within agreed timelines by introducing centralized sprint tracking and structured Agile ceremonies.</w:t>
+        <w:t>• Diagnosed and resolved complex network, hardware, and account issues for residential and business customers using internal diagnostic tools.</w:t>
       </w:r>
     </w:p>
     <w:p>
       <w:pPr>
-        <w:pStyle w:val="ListBullet"/>
-        <w:spacing w:before="20" w:after="20"/>
-        <w:ind w:left="360"/>
+        <w:spacing w:before="20" w:after="60"/>
+        <w:ind w:left="432" w:hanging="216"/>
+        <w:ind w:left="285" w:hanging="140"/>
       </w:pPr>
       <w:r>
         <w:rPr>
           <w:rFonts w:ascii="Calibri" w:hAnsi="Calibri"/>
-          <w:b/>
+          <w:color w:val="333333"/>
           <w:sz w:val="21"/>
         </w:rPr>
-        <w:t xml:space="preserve">Authored </w:t>
-      </w:r>
-      <w:r>
-        <w:rPr>
-          <w:rFonts w:ascii="Calibri" w:hAnsi="Calibri"/>
-          <w:sz w:val="21"/>
-        </w:rPr>
-        <w:t>20+ BRDs, FRDs, and PRDs across concurrent projects, reducing documentation gaps by 60% through standardized templates and a centralized repository.</w:t>
+        <w:t>• Maintained detailed case documentation, contributing to a knowledge base that improved first-contact resolution rates.</w:t>
       </w:r>
     </w:p>
     <w:p>
       <w:pPr>
-        <w:pStyle w:val="ListBullet"/>
-        <w:spacing w:before="20" w:after="20"/>
-        <w:ind w:left="360"/>
+        <w:spacing w:before="20" w:after="60"/>
+        <w:ind w:left="432" w:hanging="216"/>
+        <w:ind w:left="285" w:hanging="140"/>
       </w:pPr>
       <w:r>
         <w:rPr>
           <w:rFonts w:ascii="Calibri" w:hAnsi="Calibri"/>
-          <w:b/>
+          <w:color w:val="333333"/>
           <w:sz w:val="21"/>
         </w:rPr>
-        <w:t xml:space="preserve">Led </w:t>
-      </w:r>
-      <w:r>
-        <w:rPr>
-          <w:rFonts w:ascii="Calibri" w:hAnsi="Calibri"/>
-          <w:sz w:val="21"/>
-        </w:rPr>
-        <w:t>cross-functional teams of 8-12 developers, designers, and QA engineers across the full SDLC — managing sprint planning, daily stand-ups, retrospectives, and production releases.</w:t>
+        <w:t>• Collaborated with network operations and field teams to ensure swift resolution of service outages and escalated incidents.</w:t>
       </w:r>
     </w:p>
     <w:p>
       <w:pPr>
-        <w:pStyle w:val="ListBullet"/>
-        <w:spacing w:before="20" w:after="20"/>
-        <w:ind w:left="360"/>
-      </w:pPr>
-      <w:r>
-        <w:rPr>
-          <w:rFonts w:ascii="Calibri" w:hAnsi="Calibri"/>
-          <w:b/>
-          <w:sz w:val="21"/>
-        </w:rPr>
-        <w:t xml:space="preserve">Managed </w:t>
-      </w:r>
-      <w:r>
-        <w:rPr>
-          <w:rFonts w:ascii="Calibri" w:hAnsi="Calibri"/>
-          <w:sz w:val="21"/>
-        </w:rPr>
-        <w:t>stakeholder communication for 5+ concurrent workstreams, cutting average response time by ~30% through structured weekly reporting cadences.</w:t>
-      </w:r>
-    </w:p>
-    <w:p>
-      <w:pPr>
-        <w:pStyle w:val="ListBullet"/>
-        <w:spacing w:before="20" w:after="20"/>
-        <w:ind w:left="360"/>
-      </w:pPr>
-      <w:r>
-        <w:rPr>
-          <w:rFonts w:ascii="Calibri" w:hAnsi="Calibri"/>
-          <w:b/>
-          <w:sz w:val="21"/>
-        </w:rPr>
-        <w:t xml:space="preserve">Oversaw </w:t>
-      </w:r>
-      <w:r>
-        <w:rPr>
-          <w:rFonts w:ascii="Calibri" w:hAnsi="Calibri"/>
-          <w:sz w:val="21"/>
-        </w:rPr>
-        <w:t>Google Cloud Console (IAM, OAuth 2.0, storage, compute) and coordinated app verification submissions for secure third-party authentication compliance.</w:t>
-      </w:r>
-    </w:p>
-    <w:p>
-      <w:pPr>
-        <w:pStyle w:val="ListBullet"/>
-        <w:spacing w:before="20" w:after="20"/>
-        <w:ind w:left="360"/>
-      </w:pPr>
-      <w:r>
-        <w:rPr>
-          <w:rFonts w:ascii="Calibri" w:hAnsi="Calibri"/>
-          <w:b/>
-          <w:sz w:val="21"/>
-        </w:rPr>
-        <w:t xml:space="preserve">Spearheaded </w:t>
-      </w:r>
-      <w:r>
-        <w:rPr>
-          <w:rFonts w:ascii="Calibri" w:hAnsi="Calibri"/>
-          <w:sz w:val="21"/>
-        </w:rPr>
-        <w:t>CRM and HRMS platform implementations &amp; workflow automation, improving cross-department operational efficiency.</w:t>
-      </w:r>
-    </w:p>
-    <w:p>
-      <w:pPr>
-        <w:spacing w:before="160" w:after="20"/>
-      </w:pPr>
-      <w:r>
-        <w:rPr>
-          <w:b/>
-          <w:sz w:val="22"/>
-        </w:rPr>
-        <w:t>Technical Sales Specialist</w:t>
-      </w:r>
-      <w:r>
-        <w:rPr>
-          <w:color w:val="64748B"/>
-          <w:sz w:val="20"/>
-        </w:rPr>
-        <w:t xml:space="preserve">  |  Zedd CSR, Toronto  |  Apr 2024 – Oct 2025</w:t>
-      </w:r>
-    </w:p>
-    <w:p>
-      <w:pPr>
-        <w:pStyle w:val="ListBullet"/>
-        <w:spacing w:before="20" w:after="20"/>
-        <w:ind w:left="360"/>
-      </w:pPr>
-      <w:r>
-        <w:rPr>
-          <w:rFonts w:ascii="Calibri" w:hAnsi="Calibri"/>
-          <w:b/>
-          <w:sz w:val="21"/>
-        </w:rPr>
-        <w:t xml:space="preserve">Managed </w:t>
-      </w:r>
-      <w:r>
-        <w:rPr>
-          <w:rFonts w:ascii="Calibri" w:hAnsi="Calibri"/>
-          <w:sz w:val="21"/>
-        </w:rPr>
-        <w:t>end-to-end technical sales cycle — qualifying leads, conducting product demos, and delivering tailored proposals for IT solutions.</w:t>
-      </w:r>
-    </w:p>
-    <w:p>
-      <w:pPr>
-        <w:pStyle w:val="ListBullet"/>
-        <w:spacing w:before="20" w:after="20"/>
-        <w:ind w:left="360"/>
-      </w:pPr>
-      <w:r>
-        <w:rPr>
-          <w:rFonts w:ascii="Calibri" w:hAnsi="Calibri"/>
-          <w:b/>
-          <w:sz w:val="21"/>
-        </w:rPr>
-        <w:t xml:space="preserve">Acted </w:t>
-      </w:r>
-      <w:r>
-        <w:rPr>
-          <w:rFonts w:ascii="Calibri" w:hAnsi="Calibri"/>
-          <w:sz w:val="21"/>
-        </w:rPr>
-        <w:t>as primary bridge between clients and technical teams, ensuring accurate scoping, clear requirements, and aligned expectations for solution delivery.</w:t>
-      </w:r>
-    </w:p>
-    <w:p>
-      <w:pPr>
-        <w:pStyle w:val="ListBullet"/>
-        <w:spacing w:before="20" w:after="20"/>
-        <w:ind w:left="360"/>
-      </w:pPr>
-      <w:r>
-        <w:rPr>
-          <w:rFonts w:ascii="Calibri" w:hAnsi="Calibri"/>
-          <w:b/>
-          <w:sz w:val="21"/>
-        </w:rPr>
-        <w:t xml:space="preserve">Maintained </w:t>
-      </w:r>
-      <w:r>
-        <w:rPr>
-          <w:rFonts w:ascii="Calibri" w:hAnsi="Calibri"/>
-          <w:sz w:val="21"/>
-        </w:rPr>
-        <w:t>CRM pipelines and leveraged analytics to improve lead conversion workflows and team reporting efficiency.</w:t>
-      </w:r>
-    </w:p>
-    <w:p>
-      <w:pPr>
-        <w:spacing w:before="160" w:after="20"/>
-      </w:pPr>
-      <w:r>
-        <w:rPr>
-          <w:b/>
-          <w:sz w:val="22"/>
-        </w:rPr>
-        <w:t>Technical Support Specialist</w:t>
-      </w:r>
-      <w:r>
-        <w:rPr>
-          <w:color w:val="64748B"/>
-          <w:sz w:val="20"/>
-        </w:rPr>
-        <w:t xml:space="preserve">  |  Rogers Communications, Toronto  |  2021 – 2023</w:t>
-      </w:r>
-    </w:p>
-    <w:p>
-      <w:pPr>
-        <w:pStyle w:val="ListBullet"/>
-        <w:spacing w:before="20" w:after="20"/>
-        <w:ind w:left="360"/>
-      </w:pPr>
-      <w:r>
-        <w:rPr>
-          <w:rFonts w:ascii="Calibri" w:hAnsi="Calibri"/>
-          <w:b/>
-          <w:sz w:val="21"/>
-        </w:rPr>
-        <w:t xml:space="preserve">Diagnosed </w:t>
-      </w:r>
-      <w:r>
-        <w:rPr>
-          <w:rFonts w:ascii="Calibri" w:hAnsi="Calibri"/>
-          <w:sz w:val="21"/>
-        </w:rPr>
-        <w:t>and resolved complex network, hardware, and account issues for residential and business customers using internal diagnostic tools.</w:t>
-      </w:r>
-    </w:p>
-    <w:p>
-      <w:pPr>
-        <w:pStyle w:val="ListBullet"/>
-        <w:spacing w:before="20" w:after="20"/>
-        <w:ind w:left="360"/>
-      </w:pPr>
-      <w:r>
-        <w:rPr>
-          <w:rFonts w:ascii="Calibri" w:hAnsi="Calibri"/>
-          <w:b/>
-          <w:sz w:val="21"/>
-        </w:rPr>
-        <w:t xml:space="preserve">Maintained </w:t>
-      </w:r>
-      <w:r>
-        <w:rPr>
-          <w:rFonts w:ascii="Calibri" w:hAnsi="Calibri"/>
-          <w:sz w:val="21"/>
-        </w:rPr>
-        <w:t>detailed case documentation, contributing to a knowledge base that improved first-contact resolution rates.</w:t>
-      </w:r>
-    </w:p>
-    <w:p>
-      <w:pPr>
-        <w:pStyle w:val="ListBullet"/>
-        <w:spacing w:before="20" w:after="20"/>
-        <w:ind w:left="360"/>
-      </w:pPr>
-      <w:r>
-        <w:rPr>
-          <w:rFonts w:ascii="Calibri" w:hAnsi="Calibri"/>
-          <w:b/>
-          <w:sz w:val="21"/>
-        </w:rPr>
-        <w:t xml:space="preserve">Collaborated </w:t>
-      </w:r>
-      <w:r>
-        <w:rPr>
-          <w:rFonts w:ascii="Calibri" w:hAnsi="Calibri"/>
-          <w:sz w:val="21"/>
-        </w:rPr>
-        <w:t>with network operations and field teams to ensure swift resolution of service outages and escalated incidents.</w:t>
-      </w:r>
-    </w:p>
-    <w:p>
-      <w:pPr>
-        <w:spacing w:before="160" w:after="20"/>
-      </w:pPr>
-      <w:r>
-        <w:rPr>
-          <w:b/>
-          <w:sz w:val="22"/>
-        </w:rPr>
-        <w:t>Game Developer (Agile Delivery)</w:t>
-      </w:r>
-      <w:r>
-        <w:rPr>
-          <w:color w:val="64748B"/>
-          <w:sz w:val="20"/>
-        </w:rPr>
-        <w:t xml:space="preserve">  |  SkyHill Games  |  Nov 2017 – Nov 2020</w:t>
-      </w:r>
-    </w:p>
-    <w:p>
-      <w:pPr>
-        <w:pStyle w:val="ListBullet"/>
-        <w:spacing w:before="20" w:after="20"/>
-        <w:ind w:left="360"/>
-      </w:pPr>
-      <w:r>
-        <w:rPr>
-          <w:rFonts w:ascii="Calibri" w:hAnsi="Calibri"/>
-          <w:b/>
-          <w:sz w:val="21"/>
-        </w:rPr>
-        <w:t xml:space="preserve">Shipped </w:t>
-      </w:r>
-      <w:r>
-        <w:rPr>
-          <w:rFonts w:ascii="Calibri" w:hAnsi="Calibri"/>
-          <w:sz w:val="21"/>
-        </w:rPr>
-        <w:t>game features across mobile and desktop platforms in a sprint-based, deadline-driven environment.</w:t>
-      </w:r>
-    </w:p>
-    <w:p>
-      <w:pPr>
-        <w:pStyle w:val="ListBullet"/>
-        <w:spacing w:before="20" w:after="20"/>
-        <w:ind w:left="360"/>
-      </w:pPr>
-      <w:r>
-        <w:rPr>
-          <w:rFonts w:ascii="Calibri" w:hAnsi="Calibri"/>
-          <w:b/>
-          <w:sz w:val="21"/>
-        </w:rPr>
-        <w:t xml:space="preserve">Collaborated </w:t>
-      </w:r>
-      <w:r>
-        <w:rPr>
-          <w:rFonts w:ascii="Calibri" w:hAnsi="Calibri"/>
-          <w:sz w:val="21"/>
-        </w:rPr>
-        <w:t>with artists, designers, and QA in Agile workflows — building foundational experience in backlog grooming, sprint planning, and iterative release management.</w:t>
-      </w:r>
-    </w:p>
-    <w:p>
-      <w:pPr>
-        <w:spacing w:before="240" w:after="80"/>
-        <w:pBdr>
-          <w:bottom w:val="single" w:sz="6" w:space="1" w:color="7C3AED"/>
-        </w:pBdr>
+        <w:keepNext/>
+        <w:spacing w:before="160" w:after="0"/>
       </w:pPr>
       <w:r>
         <w:rPr>
@@ -756,16 +610,86 @@
           <w:color w:val="1E293B"/>
           <w:sz w:val="22"/>
         </w:rPr>
+        <w:t>Game Developer — Agile Delivery</w:t>
+      </w:r>
+      <w:r>
+        <w:rPr>
+          <w:color w:val="6B7280"/>
+          <w:sz w:val="21"/>
+        </w:rPr>
+        <w:t xml:space="preserve">  |  SkyHill Games</w:t>
+      </w:r>
+    </w:p>
+    <w:p>
+      <w:pPr>
+        <w:spacing w:before="0" w:after="60"/>
+      </w:pPr>
+      <w:r>
+        <w:rPr>
+          <w:rFonts w:ascii="Calibri" w:hAnsi="Calibri"/>
+          <w:b w:val="0"/>
+          <w:color w:val="7C3AED"/>
+          <w:sz w:val="20"/>
+        </w:rPr>
+        <w:t>Nov 2017 – Nov 2020</w:t>
+      </w:r>
+    </w:p>
+    <w:p>
+      <w:pPr>
+        <w:spacing w:before="20" w:after="60"/>
+        <w:ind w:left="432" w:hanging="216"/>
+        <w:ind w:left="285" w:hanging="140"/>
+      </w:pPr>
+      <w:r>
+        <w:rPr>
+          <w:rFonts w:ascii="Calibri" w:hAnsi="Calibri"/>
+          <w:color w:val="333333"/>
+          <w:sz w:val="21"/>
+        </w:rPr>
+        <w:t>• Shipped game features across mobile and desktop platforms in sprint-based, deadline-driven environment.</w:t>
+      </w:r>
+    </w:p>
+    <w:p>
+      <w:pPr>
+        <w:spacing w:before="20" w:after="60"/>
+        <w:ind w:left="432" w:hanging="216"/>
+        <w:ind w:left="285" w:hanging="140"/>
+      </w:pPr>
+      <w:r>
+        <w:rPr>
+          <w:rFonts w:ascii="Calibri" w:hAnsi="Calibri"/>
+          <w:color w:val="333333"/>
+          <w:sz w:val="21"/>
+        </w:rPr>
+        <w:t>• Collaborated with artists, designers, and QA in Agile workflows — building experience in backlog grooming, sprint planning, and iterative release management.</w:t>
+      </w:r>
+    </w:p>
+    <w:p>
+      <w:pPr>
+        <w:keepNext/>
+        <w:spacing w:before="280" w:after="80"/>
+        <w:pBdr>
+          <w:bottom w:val="single" w:sz="8" w:space="1" w:color="7C3AED"/>
+        </w:pBdr>
+      </w:pPr>
+      <w:r>
+        <w:rPr>
+          <w:b/>
+          <w:color w:val="1E293B"/>
+          <w:sz w:val="23"/>
+        </w:rPr>
         <w:t>KEY PROJECTS</w:t>
       </w:r>
     </w:p>
     <w:p>
       <w:pPr>
+        <w:keepNext/>
         <w:spacing w:before="80" w:after="20"/>
       </w:pPr>
       <w:r>
         <w:rPr>
           <w:b/>
+          <w:color w:val="1E293B"/>
           <w:sz w:val="21"/>
         </w:rPr>
         <w:t>TeamGrid — HRMS &amp; Employee Management Platform</w:t>
@@ -773,130 +697,153 @@
     </w:p>
     <w:p>
       <w:pPr>
-        <w:pStyle w:val="ListBullet"/>
-        <w:spacing w:before="20" w:after="20"/>
-        <w:ind w:left="360"/>
+        <w:spacing w:before="20" w:after="40"/>
+        <w:ind w:left="432" w:hanging="216"/>
+        <w:ind w:left="285" w:hanging="140"/>
       </w:pPr>
       <w:r>
         <w:rPr>
           <w:rFonts w:ascii="Calibri" w:hAnsi="Calibri"/>
+          <w:color w:val="333333"/>
           <w:sz w:val="21"/>
         </w:rPr>
-        <w:t>Authored FRDs and BRDs for 5+ HRMS modules (employee management, dashboards, announcements, rewards, polls).</w:t>
+        <w:t>• Authored FRDs and BRDs for 5+ HRMS modules (employee management, dashboards, announcements, rewards, polls).</w:t>
       </w:r>
     </w:p>
     <w:p>
       <w:pPr>
-        <w:pStyle w:val="ListBullet"/>
-        <w:spacing w:before="20" w:after="20"/>
-        <w:ind w:left="360"/>
+        <w:spacing w:before="20" w:after="40"/>
+        <w:ind w:left="432" w:hanging="216"/>
+        <w:ind w:left="285" w:hanging="140"/>
       </w:pPr>
       <w:r>
         <w:rPr>
           <w:rFonts w:ascii="Calibri" w:hAnsi="Calibri"/>
+          <w:color w:val="333333"/>
           <w:sz w:val="21"/>
         </w:rPr>
-        <w:t>Managed sprint planning and cross-team workflow tracking across 5+ concurrent workstreams.</w:t>
+        <w:t>• Managed sprint planning and cross-team workflow tracking across 5+ concurrent workstreams.</w:t>
       </w:r>
     </w:p>
     <w:p>
       <w:pPr>
-        <w:pStyle w:val="ListBullet"/>
-        <w:spacing w:before="20" w:after="20"/>
-        <w:ind w:left="360"/>
+        <w:spacing w:before="20" w:after="40"/>
+        <w:ind w:left="432" w:hanging="216"/>
+        <w:ind w:left="285" w:hanging="140"/>
       </w:pPr>
       <w:r>
         <w:rPr>
           <w:rFonts w:ascii="Calibri" w:hAnsi="Calibri"/>
+          <w:color w:val="333333"/>
           <w:sz w:val="21"/>
         </w:rPr>
-        <w:t>Coordinated QA testing, bug tracking, and production releases with full sprint documentation.</w:t>
+        <w:t>• Coordinated QA testing, bug tracking, and production releases with full sprint documentation.</w:t>
       </w:r>
     </w:p>
     <w:p>
       <w:pPr>
+        <w:keepNext/>
         <w:spacing w:before="80" w:after="20"/>
       </w:pPr>
       <w:r>
         <w:rPr>
           <w:b/>
+          <w:color w:val="1E293B"/>
           <w:sz w:val="21"/>
         </w:rPr>
-        <w:t>CRM Development &amp; Workflow Automation Platform</w:t>
+        <w:t>CRM &amp; Workflow Automation Platform</w:t>
       </w:r>
     </w:p>
     <w:p>
       <w:pPr>
-        <w:pStyle w:val="ListBullet"/>
-        <w:spacing w:before="20" w:after="20"/>
-        <w:ind w:left="360"/>
+        <w:spacing w:before="20" w:after="40"/>
+        <w:ind w:left="432" w:hanging="216"/>
+        <w:ind w:left="285" w:hanging="140"/>
       </w:pPr>
       <w:r>
         <w:rPr>
           <w:rFonts w:ascii="Calibri" w:hAnsi="Calibri"/>
+          <w:color w:val="333333"/>
           <w:sz w:val="21"/>
         </w:rPr>
-        <w:t>Authored PRDs/FRDs for lead management, sales pipeline tracking, and marketing automation features.</w:t>
+        <w:t>• Authored PRDs/FRDs for lead management, sales pipeline tracking, and marketing automation features.</w:t>
       </w:r>
     </w:p>
     <w:p>
       <w:pPr>
-        <w:pStyle w:val="ListBullet"/>
-        <w:spacing w:before="20" w:after="20"/>
-        <w:ind w:left="360"/>
+        <w:spacing w:before="20" w:after="40"/>
+        <w:ind w:left="432" w:hanging="216"/>
+        <w:ind w:left="285" w:hanging="140"/>
       </w:pPr>
       <w:r>
         <w:rPr>
           <w:rFonts w:ascii="Calibri" w:hAnsi="Calibri"/>
+          <w:color w:val="333333"/>
           <w:sz w:val="21"/>
         </w:rPr>
-        <w:t>Oversaw API integrations (Plivo VoIP, Google Meet) coordinating between dev teams and third-party vendors.</w:t>
+        <w:t>• Oversaw API integrations (Plivo VoIP, Google Meet) coordinating between dev teams and third-party vendors.</w:t>
       </w:r>
     </w:p>
     <w:p>
       <w:pPr>
-        <w:pStyle w:val="ListBullet"/>
-        <w:spacing w:before="20" w:after="20"/>
-        <w:ind w:left="360"/>
+        <w:spacing w:before="20" w:after="40"/>
+        <w:ind w:left="432" w:hanging="216"/>
+        <w:ind w:left="285" w:hanging="140"/>
       </w:pPr>
       <w:r>
         <w:rPr>
           <w:rFonts w:ascii="Calibri" w:hAnsi="Calibri"/>
+          <w:color w:val="333333"/>
           <w:sz w:val="21"/>
         </w:rPr>
-        <w:t>Monitored sprint velocity and resolved blockers across product, engineering, and QA teams.</w:t>
+        <w:t>• Monitored sprint velocity and resolved blockers across product, engineering, and QA teams.</w:t>
       </w:r>
     </w:p>
     <w:p>
       <w:pPr>
-        <w:spacing w:before="240" w:after="80"/>
+        <w:keepNext/>
+        <w:spacing w:before="280" w:after="80"/>
         <w:pBdr>
-          <w:bottom w:val="single" w:sz="6" w:space="1" w:color="7C3AED"/>
+          <w:bottom w:val="single" w:sz="8" w:space="1" w:color="7C3AED"/>
         </w:pBdr>
       </w:pPr>
       <w:r>
         <w:rPr>
           <w:b/>
           <w:color w:val="1E293B"/>
-          <w:sz w:val="22"/>
+          <w:sz w:val="23"/>
         </w:rPr>
         <w:t>EDUCATION</w:t>
       </w:r>
     </w:p>
     <w:p>
       <w:pPr>
-        <w:spacing w:before="80" w:after="20"/>
+        <w:keepNext/>
+        <w:spacing w:before="80" w:after="0"/>
       </w:pPr>
       <w:r>
         <w:rPr>
           <w:b/>
+          <w:color w:val="1E293B"/>
           <w:sz w:val="21"/>
         </w:rPr>
-        <w:t>PGDM in Artificial Intelligence &amp; Machine Learning</w:t>
+        <w:t>Post-Graduate Diploma in AI &amp; Machine Learning</w:t>
+      </w:r>
+    </w:p>
+    <w:p>
+      <w:pPr>
+        <w:spacing w:before="0" w:after="20"/>
+      </w:pPr>
+      <w:r>
+        <w:rPr>
+          <w:color w:val="6B7280"/>
+          <w:sz w:val="20"/>
+        </w:rPr>
+        <w:t>Lambton College, Toronto, Canada</w:t>
       </w:r>
       <w:r>
         <w:rPr>
-          <w:color w:val="64748B"/>
+          <w:color w:val="7C3AED"/>
           <w:sz w:val="20"/>
         </w:rPr>
         <w:t xml:space="preserve">  |  2020 – 2022</w:t>
@@ -904,50 +851,40 @@
     </w:p>
     <w:p>
       <w:pPr>
-        <w:spacing w:before="0" w:after="80"/>
+        <w:keepNext/>
+        <w:spacing w:before="80" w:after="0"/>
       </w:pPr>
       <w:r>
         <w:rPr>
-          <w:color w:val="475266"/>
-          <w:sz w:val="20"/>
+          <w:b/>
+          <w:color w:val="1E293B"/>
+          <w:sz w:val="21"/>
         </w:rPr>
-        <w:t>Lambton College, Toronto, Canada</w:t>
+        <w:t>Bachelor of Information Technology</w:t>
       </w:r>
     </w:p>
     <w:p>
       <w:pPr>
-        <w:spacing w:before="40" w:after="20"/>
+        <w:spacing w:before="0" w:after="20"/>
       </w:pPr>
       <w:r>
         <w:rPr>
-          <w:b/>
-          <w:sz w:val="21"/>
+          <w:color w:val="6B7280"/>
+          <w:sz w:val="20"/>
         </w:rPr>
-        <w:t>Bachelor's Degree in Information Technology</w:t>
+        <w:t>Alpha College of Engineering &amp; Technology, Ahmedabad</w:t>
       </w:r>
       <w:r>
         <w:rPr>
-          <w:color w:val="64748B"/>
+          <w:color w:val="7C3AED"/>
           <w:sz w:val="20"/>
         </w:rPr>
         <w:t xml:space="preserve">  |  2013 – 2017</w:t>
       </w:r>
     </w:p>
-    <w:p>
-      <w:pPr>
-        <w:spacing w:before="0" w:after="0"/>
-      </w:pPr>
-      <w:r>
-        <w:rPr>
-          <w:color w:val="475266"/>
-          <w:sz w:val="20"/>
-        </w:rPr>
-        <w:t>Alpha College of Engineering &amp; Technology, Ahmedabad</w:t>
-      </w:r>
-    </w:p>
     <w:sectPr>
       <w:pgSz w:w="12240" w:h="15840"/>
-      <w:pgMar w:top="864" w:right="1080" w:bottom="864" w:left="1080" w:header="720" w:footer="720" w:gutter="0"/>
+      <w:pgMar w:top="720" w:right="1080" w:bottom="720" w:left="1080" w:header="720" w:footer="720" w:gutter="0"/>
       <w:cols w:space="720"/>
       <w:docGrid w:linePitch="360"/>
     </w:sectPr>
@@ -1318,6 +1255,9 @@
     <w:name w:val="Normal"/>
     <w:qFormat/>
     <w:rsid w:val="00FC693F"/>
+    <w:pPr>
+      <w:spacing w:before="0" w:after="0" w:line="276" w:lineRule="auto"/>
+    </w:pPr>
     <w:rPr>
       <w:rFonts w:ascii="Calibri" w:hAnsi="Calibri"/>
       <w:sz w:val="21"/>

</xml_diff>

<commit_message>
feat: add AI & Technical Skills section to resume
</commit_message>
<xml_diff>
--- a/public/Herat_Shah_IT_Project_Coordinator_Resume.docx
+++ b/public/Herat_Shah_IT_Project_Coordinator_Resume.docx
@@ -44,7 +44,6 @@
       <w:hyperlink r:id="rId9">
         <w:r>
           <w:rPr>
-            <w:rStyle w:val="Hyperlink"/>
             <w:color w:val="7C3AED"/>
             <w:u w:val="single"/>
             <w:sz w:val="20"/>
@@ -63,7 +62,6 @@
       <w:hyperlink r:id="rId10">
         <w:r>
           <w:rPr>
-            <w:rStyle w:val="Hyperlink"/>
             <w:color w:val="7C3AED"/>
             <w:u w:val="single"/>
             <w:sz w:val="20"/>
@@ -82,7 +80,6 @@
       <w:hyperlink r:id="rId11">
         <w:r>
           <w:rPr>
-            <w:rStyle w:val="Hyperlink"/>
             <w:color w:val="7C3AED"/>
             <w:u w:val="single"/>
             <w:sz w:val="20"/>
@@ -101,7 +98,6 @@
       <w:hyperlink r:id="rId12">
         <w:r>
           <w:rPr>
-            <w:rStyle w:val="Hyperlink"/>
             <w:color w:val="7C3AED"/>
             <w:u w:val="single"/>
             <w:sz w:val="20"/>
@@ -161,7 +157,7 @@
     </w:p>
     <w:p>
       <w:pPr>
-        <w:spacing w:before="20" w:after="20"/>
+        <w:spacing w:before="0" w:after="0"/>
         <w:ind w:left="216"/>
       </w:pPr>
       <w:r>
@@ -169,7 +165,7 @@
           <w:rFonts w:ascii="Calibri" w:hAnsi="Calibri"/>
           <w:b/>
           <w:color w:val="1E293B"/>
-          <w:sz w:val="20"/>
+          <w:sz w:val="19"/>
         </w:rPr>
         <w:t>Project Management:</w:t>
       </w:r>
@@ -177,14 +173,14 @@
         <w:rPr>
           <w:rFonts w:ascii="Calibri" w:hAnsi="Calibri"/>
           <w:color w:val="333333"/>
-          <w:sz w:val="20"/>
+          <w:sz w:val="19"/>
         </w:rPr>
         <w:t xml:space="preserve"> Agile, Scrum, Sprint Planning, SDLC, Risk Management, Release Management, Jira</w:t>
       </w:r>
     </w:p>
     <w:p>
       <w:pPr>
-        <w:spacing w:before="20" w:after="20"/>
+        <w:spacing w:before="0" w:after="0"/>
         <w:ind w:left="216"/>
       </w:pPr>
       <w:r>
@@ -192,7 +188,7 @@
           <w:rFonts w:ascii="Calibri" w:hAnsi="Calibri"/>
           <w:b/>
           <w:color w:val="1E293B"/>
-          <w:sz w:val="20"/>
+          <w:sz w:val="19"/>
         </w:rPr>
         <w:t>Documentation &amp; Analysis:</w:t>
       </w:r>
@@ -200,14 +196,14 @@
         <w:rPr>
           <w:rFonts w:ascii="Calibri" w:hAnsi="Calibri"/>
           <w:color w:val="333333"/>
-          <w:sz w:val="20"/>
+          <w:sz w:val="19"/>
         </w:rPr>
         <w:t xml:space="preserve"> BRD, FRD, PRD, Technical Documentation, Requirement Gathering, Process Mapping</w:t>
       </w:r>
     </w:p>
     <w:p>
       <w:pPr>
-        <w:spacing w:before="20" w:after="20"/>
+        <w:spacing w:before="0" w:after="0"/>
         <w:ind w:left="216"/>
       </w:pPr>
       <w:r>
@@ -215,7 +211,7 @@
           <w:rFonts w:ascii="Calibri" w:hAnsi="Calibri"/>
           <w:b/>
           <w:color w:val="1E293B"/>
-          <w:sz w:val="20"/>
+          <w:sz w:val="19"/>
         </w:rPr>
         <w:t>Tools &amp; Platforms:</w:t>
       </w:r>
@@ -223,14 +219,14 @@
         <w:rPr>
           <w:rFonts w:ascii="Calibri" w:hAnsi="Calibri"/>
           <w:color w:val="333333"/>
-          <w:sz w:val="20"/>
+          <w:sz w:val="19"/>
         </w:rPr>
         <w:t xml:space="preserve"> Jira, GCP, Google Workspace, MS Office, Slack, Git, GitHub, Vercel, Figma</w:t>
       </w:r>
     </w:p>
     <w:p>
       <w:pPr>
-        <w:spacing w:before="20" w:after="20"/>
+        <w:spacing w:before="0" w:after="0"/>
         <w:ind w:left="216"/>
       </w:pPr>
       <w:r>
@@ -238,7 +234,7 @@
           <w:rFonts w:ascii="Calibri" w:hAnsi="Calibri"/>
           <w:b/>
           <w:color w:val="1E293B"/>
-          <w:sz w:val="20"/>
+          <w:sz w:val="19"/>
         </w:rPr>
         <w:t>Coordination &amp; Leadership:</w:t>
       </w:r>
@@ -246,14 +242,14 @@
         <w:rPr>
           <w:rFonts w:ascii="Calibri" w:hAnsi="Calibri"/>
           <w:color w:val="333333"/>
-          <w:sz w:val="20"/>
+          <w:sz w:val="19"/>
         </w:rPr>
         <w:t xml:space="preserve"> Cross-functional Teams, Stakeholder Communication, Vendor Management, Remote Collaboration</w:t>
       </w:r>
     </w:p>
     <w:p>
       <w:pPr>
-        <w:spacing w:before="20" w:after="20"/>
+        <w:spacing w:before="0" w:after="0"/>
         <w:ind w:left="216"/>
       </w:pPr>
       <w:r>
@@ -261,22 +257,39 @@
           <w:rFonts w:ascii="Calibri" w:hAnsi="Calibri"/>
           <w:b/>
           <w:color w:val="1E293B"/>
-          <w:sz w:val="20"/>
+          <w:sz w:val="19"/>
         </w:rPr>
-        <w:t>Technical Proficiency:</w:t>
+        <w:t>Process Optimization:</w:t>
       </w:r>
       <w:r>
         <w:rPr>
           <w:rFonts w:ascii="Calibri" w:hAnsi="Calibri"/>
           <w:color w:val="333333"/>
-          <w:sz w:val="20"/>
+          <w:sz w:val="19"/>
         </w:rPr>
-        <w:t xml:space="preserve"> AI-Assisted Workflows, Prompt Engineering, RAG, Vector DBs, React, Python, Node.js</w:t>
+        <w:t xml:space="preserve"> Workflow Automation, SOP Development, KPI Tracking, QA Coordination, Data Analysis</w:t>
       </w:r>
     </w:p>
     <w:p>
       <w:pPr>
-        <w:spacing w:before="20" w:after="20"/>
+        <w:keepNext/>
+        <w:spacing w:before="280" w:after="80"/>
+        <w:pBdr>
+          <w:bottom w:val="single" w:sz="8" w:space="1" w:color="7C3AED"/>
+        </w:pBdr>
+      </w:pPr>
+      <w:r>
+        <w:rPr>
+          <w:b/>
+          <w:color w:val="1E293B"/>
+          <w:sz w:val="23"/>
+        </w:rPr>
+        <w:t>AI &amp; TECHNICAL SKILLS</w:t>
+      </w:r>
+    </w:p>
+    <w:p>
+      <w:pPr>
+        <w:spacing w:before="0" w:after="0"/>
         <w:ind w:left="216"/>
       </w:pPr>
       <w:r>
@@ -284,17 +297,132 @@
           <w:rFonts w:ascii="Calibri" w:hAnsi="Calibri"/>
           <w:b/>
           <w:color w:val="1E293B"/>
-          <w:sz w:val="20"/>
+          <w:sz w:val="19"/>
         </w:rPr>
-        <w:t>Process Optimization:</w:t>
+        <w:t>Frontend Development:</w:t>
       </w:r>
       <w:r>
         <w:rPr>
           <w:rFonts w:ascii="Calibri" w:hAnsi="Calibri"/>
           <w:color w:val="333333"/>
-          <w:sz w:val="20"/>
+          <w:sz w:val="19"/>
         </w:rPr>
-        <w:t xml:space="preserve"> Workflow Automation, SOP Development, KPI Tracking, QA Coordination, Data Analysis</w:t>
+        <w:t xml:space="preserve"> React/Next.js, TypeScript/JavaScript, Tailwind CSS, HTML5/CSS3, Responsive Design, State Management</w:t>
+      </w:r>
+    </w:p>
+    <w:p>
+      <w:pPr>
+        <w:spacing w:before="0" w:after="0"/>
+        <w:ind w:left="216"/>
+      </w:pPr>
+      <w:r>
+        <w:rPr>
+          <w:rFonts w:ascii="Calibri" w:hAnsi="Calibri"/>
+          <w:b/>
+          <w:color w:val="1E293B"/>
+          <w:sz w:val="19"/>
+        </w:rPr>
+        <w:t>Backend Development:</w:t>
+      </w:r>
+      <w:r>
+        <w:rPr>
+          <w:rFonts w:ascii="Calibri" w:hAnsi="Calibri"/>
+          <w:color w:val="333333"/>
+          <w:sz w:val="19"/>
+        </w:rPr>
+        <w:t xml:space="preserve"> Node.js/Express, Python (FastAPI/Flask), RESTful APIs, PostgreSQL, Supabase, Firebase, Auth</w:t>
+      </w:r>
+    </w:p>
+    <w:p>
+      <w:pPr>
+        <w:spacing w:before="0" w:after="0"/>
+        <w:ind w:left="216"/>
+      </w:pPr>
+      <w:r>
+        <w:rPr>
+          <w:rFonts w:ascii="Calibri" w:hAnsi="Calibri"/>
+          <w:b/>
+          <w:color w:val="1E293B"/>
+          <w:sz w:val="19"/>
+        </w:rPr>
+        <w:t>AI &amp; Chatbot Engineering:</w:t>
+      </w:r>
+      <w:r>
+        <w:rPr>
+          <w:rFonts w:ascii="Calibri" w:hAnsi="Calibri"/>
+          <w:color w:val="333333"/>
+          <w:sz w:val="19"/>
+        </w:rPr>
+        <w:t xml:space="preserve"> LLM Integration (OpenAI, Claude), Chatbot Dev, Prompt Engineering, AI Agents, Open Code/OpenClaw, Cursor, Claude Code</w:t>
+      </w:r>
+    </w:p>
+    <w:p>
+      <w:pPr>
+        <w:spacing w:before="0" w:after="0"/>
+        <w:ind w:left="216"/>
+      </w:pPr>
+      <w:r>
+        <w:rPr>
+          <w:rFonts w:ascii="Calibri" w:hAnsi="Calibri"/>
+          <w:b/>
+          <w:color w:val="1E293B"/>
+          <w:sz w:val="19"/>
+        </w:rPr>
+        <w:t>RAG &amp; Vector Databases:</w:t>
+      </w:r>
+      <w:r>
+        <w:rPr>
+          <w:rFonts w:ascii="Calibri" w:hAnsi="Calibri"/>
+          <w:color w:val="333333"/>
+          <w:sz w:val="19"/>
+        </w:rPr>
+        <w:t xml:space="preserve"> RAG Implementation, Qdrant, Pinecone, Chunking, Text Embeddings, Semantic Search, Knowledge Retrieval</w:t>
+      </w:r>
+    </w:p>
+    <w:p>
+      <w:pPr>
+        <w:spacing w:before="0" w:after="0"/>
+        <w:ind w:left="216"/>
+      </w:pPr>
+      <w:r>
+        <w:rPr>
+          <w:rFonts w:ascii="Calibri" w:hAnsi="Calibri"/>
+          <w:b/>
+          <w:color w:val="1E293B"/>
+          <w:sz w:val="19"/>
+        </w:rPr>
+        <w:t>UI/UX Design:</w:t>
+      </w:r>
+      <w:r>
+        <w:rPr>
+          <w:rFonts w:ascii="Calibri" w:hAnsi="Calibri"/>
+          <w:color w:val="333333"/>
+          <w:sz w:val="19"/>
+        </w:rPr>
+        <w:t xml:space="preserve"> Figma, Wireframing, Prototyping, User Research, Design Systems, Responsive Layouts, Accessibility</w:t>
+      </w:r>
+    </w:p>
+    <w:p>
+      <w:pPr>
+        <w:spacing w:before="0" w:after="0"/>
+        <w:ind w:left="216"/>
+      </w:pPr>
+      <w:r>
+        <w:rPr>
+          <w:rFonts w:ascii="Calibri" w:hAnsi="Calibri"/>
+          <w:b/>
+          <w:color w:val="1E293B"/>
+          <w:sz w:val="19"/>
+        </w:rPr>
+        <w:t>Mobile Development:</w:t>
+      </w:r>
+      <w:r>
+        <w:rPr>
+          <w:rFonts w:ascii="Calibri" w:hAnsi="Calibri"/>
+          <w:color w:val="333333"/>
+          <w:sz w:val="19"/>
+        </w:rPr>
+        <w:t xml:space="preserve"> React Native, Cross-Platform Dev, Mobile-First Design, App Store Deployment, Push Notifications</w:t>
       </w:r>
     </w:p>
     <w:p>
@@ -352,7 +480,7 @@
     <w:p>
       <w:pPr>
         <w:spacing w:before="20" w:after="60"/>
-        <w:ind w:left="432" w:hanging="216"/>
+        <w:ind w:left="432"/>
         <w:ind w:left="285" w:hanging="140"/>
       </w:pPr>
       <w:r>
@@ -367,7 +495,7 @@
     <w:p>
       <w:pPr>
         <w:spacing w:before="20" w:after="60"/>
-        <w:ind w:left="432" w:hanging="216"/>
+        <w:ind w:left="432"/>
         <w:ind w:left="285" w:hanging="140"/>
       </w:pPr>
       <w:r>
@@ -382,7 +510,7 @@
     <w:p>
       <w:pPr>
         <w:spacing w:before="20" w:after="60"/>
-        <w:ind w:left="432" w:hanging="216"/>
+        <w:ind w:left="432"/>
         <w:ind w:left="285" w:hanging="140"/>
       </w:pPr>
       <w:r>
@@ -397,7 +525,7 @@
     <w:p>
       <w:pPr>
         <w:spacing w:before="20" w:after="60"/>
-        <w:ind w:left="432" w:hanging="216"/>
+        <w:ind w:left="432"/>
         <w:ind w:left="285" w:hanging="140"/>
       </w:pPr>
       <w:r>
@@ -412,7 +540,7 @@
     <w:p>
       <w:pPr>
         <w:spacing w:before="20" w:after="60"/>
-        <w:ind w:left="432" w:hanging="216"/>
+        <w:ind w:left="432"/>
         <w:ind w:left="285" w:hanging="140"/>
       </w:pPr>
       <w:r>
@@ -427,7 +555,7 @@
     <w:p>
       <w:pPr>
         <w:spacing w:before="20" w:after="60"/>
-        <w:ind w:left="432" w:hanging="216"/>
+        <w:ind w:left="432"/>
         <w:ind w:left="285" w:hanging="140"/>
       </w:pPr>
       <w:r>
@@ -442,7 +570,7 @@
     <w:p>
       <w:pPr>
         <w:keepNext/>
-        <w:spacing w:before="160" w:after="0"/>
+        <w:spacing w:before="120" w:after="0"/>
       </w:pPr>
       <w:r>
         <w:rPr>
@@ -477,7 +605,7 @@
     <w:p>
       <w:pPr>
         <w:spacing w:before="20" w:after="60"/>
-        <w:ind w:left="432" w:hanging="216"/>
+        <w:ind w:left="432"/>
         <w:ind w:left="285" w:hanging="140"/>
       </w:pPr>
       <w:r>
@@ -492,7 +620,7 @@
     <w:p>
       <w:pPr>
         <w:spacing w:before="20" w:after="60"/>
-        <w:ind w:left="432" w:hanging="216"/>
+        <w:ind w:left="432"/>
         <w:ind w:left="285" w:hanging="140"/>
       </w:pPr>
       <w:r>
@@ -507,7 +635,7 @@
     <w:p>
       <w:pPr>
         <w:spacing w:before="20" w:after="60"/>
-        <w:ind w:left="432" w:hanging="216"/>
+        <w:ind w:left="432"/>
         <w:ind w:left="285" w:hanging="140"/>
       </w:pPr>
       <w:r>
@@ -522,7 +650,7 @@
     <w:p>
       <w:pPr>
         <w:keepNext/>
-        <w:spacing w:before="160" w:after="0"/>
+        <w:spacing w:before="120" w:after="0"/>
       </w:pPr>
       <w:r>
         <w:rPr>
@@ -557,7 +685,7 @@
     <w:p>
       <w:pPr>
         <w:spacing w:before="20" w:after="60"/>
-        <w:ind w:left="432" w:hanging="216"/>
+        <w:ind w:left="432"/>
         <w:ind w:left="285" w:hanging="140"/>
       </w:pPr>
       <w:r>
@@ -572,7 +700,7 @@
     <w:p>
       <w:pPr>
         <w:spacing w:before="20" w:after="60"/>
-        <w:ind w:left="432" w:hanging="216"/>
+        <w:ind w:left="432"/>
         <w:ind w:left="285" w:hanging="140"/>
       </w:pPr>
       <w:r>
@@ -587,7 +715,7 @@
     <w:p>
       <w:pPr>
         <w:spacing w:before="20" w:after="60"/>
-        <w:ind w:left="432" w:hanging="216"/>
+        <w:ind w:left="432"/>
         <w:ind w:left="285" w:hanging="140"/>
       </w:pPr>
       <w:r>
@@ -602,7 +730,7 @@
     <w:p>
       <w:pPr>
         <w:keepNext/>
-        <w:spacing w:before="160" w:after="0"/>
+        <w:spacing w:before="120" w:after="0"/>
       </w:pPr>
       <w:r>
         <w:rPr>
@@ -637,7 +765,7 @@
     <w:p>
       <w:pPr>
         <w:spacing w:before="20" w:after="60"/>
-        <w:ind w:left="432" w:hanging="216"/>
+        <w:ind w:left="432"/>
         <w:ind w:left="285" w:hanging="140"/>
       </w:pPr>
       <w:r>
@@ -652,7 +780,7 @@
     <w:p>
       <w:pPr>
         <w:spacing w:before="20" w:after="60"/>
-        <w:ind w:left="432" w:hanging="216"/>
+        <w:ind w:left="432"/>
         <w:ind w:left="285" w:hanging="140"/>
       </w:pPr>
       <w:r>
@@ -698,7 +826,7 @@
     <w:p>
       <w:pPr>
         <w:spacing w:before="20" w:after="40"/>
-        <w:ind w:left="432" w:hanging="216"/>
+        <w:ind w:left="432"/>
         <w:ind w:left="285" w:hanging="140"/>
       </w:pPr>
       <w:r>
@@ -713,7 +841,7 @@
     <w:p>
       <w:pPr>
         <w:spacing w:before="20" w:after="40"/>
-        <w:ind w:left="432" w:hanging="216"/>
+        <w:ind w:left="432"/>
         <w:ind w:left="285" w:hanging="140"/>
       </w:pPr>
       <w:r>
@@ -728,7 +856,7 @@
     <w:p>
       <w:pPr>
         <w:spacing w:before="20" w:after="40"/>
-        <w:ind w:left="432" w:hanging="216"/>
+        <w:ind w:left="432"/>
         <w:ind w:left="285" w:hanging="140"/>
       </w:pPr>
       <w:r>
@@ -757,7 +885,7 @@
     <w:p>
       <w:pPr>
         <w:spacing w:before="20" w:after="40"/>
-        <w:ind w:left="432" w:hanging="216"/>
+        <w:ind w:left="432"/>
         <w:ind w:left="285" w:hanging="140"/>
       </w:pPr>
       <w:r>
@@ -772,7 +900,7 @@
     <w:p>
       <w:pPr>
         <w:spacing w:before="20" w:after="40"/>
-        <w:ind w:left="432" w:hanging="216"/>
+        <w:ind w:left="432"/>
         <w:ind w:left="285" w:hanging="140"/>
       </w:pPr>
       <w:r>
@@ -787,7 +915,7 @@
     <w:p>
       <w:pPr>
         <w:spacing w:before="20" w:after="40"/>
-        <w:ind w:left="432" w:hanging="216"/>
+        <w:ind w:left="432"/>
         <w:ind w:left="285" w:hanging="140"/>
       </w:pPr>
       <w:r>

</xml_diff>